<commit_message>
fix(template): patch keperluan lain template to merge split tags
</commit_message>
<xml_diff>
--- a/templates/surat-rekomendasi-keperluan-lain/surat-rekomendasi-lain-template-v1.docx
+++ b/templates/surat-rekomendasi-keperluan-lain/surat-rekomendasi-lain-template-v1.docx
@@ -428,18 +428,11 @@
       <w:r>
         <w:rPr>
           <w:rFonts w:ascii="Times New Roman" w:eastAsia="Times New Roman" w:hAnsi="Times New Roman" w:cs="Times New Roman"/>
-          <w:sz w:val="24"/>
-          <w:szCs w:val="24"/>
-        </w:rPr>
-        <w:t>{{program_studi}</w:t>
-      </w:r>
-      <w:r>
-        <w:rPr>
-          <w:rFonts w:ascii="Times New Roman" w:eastAsia="Times New Roman" w:hAnsi="Times New Roman" w:cs="Times New Roman"/>
-          <w:sz w:val="24"/>
-          <w:szCs w:val="24"/>
-        </w:rPr>
-        <w:t>}</w:t>
+          <w:color w:val="000000"/>
+          <w:sz w:val="24"/>
+          <w:szCs w:val="24"/>
+        </w:rPr>
+        <w:t>{{program_studi}}</w:t>
       </w:r>
     </w:p>
     <w:p>
@@ -1006,25 +999,7 @@
                                 <w:sz w:val="24"/>
                                 <w:szCs w:val="24"/>
                               </w:rPr>
-                              <w:t>{</w:t>
-                            </w:r>
-                            <w:r>
-                              <w:rPr>
-                                <w:rFonts w:ascii="Times New Roman" w:eastAsia="Times New Roman" w:hAnsi="Times New Roman" w:cs="Times New Roman"/>
-                                <w:color w:val="000000"/>
-                                <w:sz w:val="24"/>
-                                <w:szCs w:val="24"/>
-                              </w:rPr>
-                              <w:t>{%stamp_image}</w:t>
-                            </w:r>
-                            <w:r>
-                              <w:rPr>
-                                <w:rFonts w:ascii="Times New Roman" w:eastAsia="Times New Roman" w:hAnsi="Times New Roman" w:cs="Times New Roman"/>
-                                <w:color w:val="000000"/>
-                                <w:sz w:val="24"/>
-                                <w:szCs w:val="24"/>
-                              </w:rPr>
-                              <w:t>}</w:t>
+                              <w:t>{{%stamp_image}}</w:t>
                             </w:r>
                           </w:p>
                         </w:txbxContent>
@@ -1063,25 +1038,7 @@
                           <w:sz w:val="24"/>
                           <w:szCs w:val="24"/>
                         </w:rPr>
-                        <w:t>{</w:t>
-                      </w:r>
-                      <w:r>
-                        <w:rPr>
-                          <w:rFonts w:ascii="Times New Roman" w:eastAsia="Times New Roman" w:hAnsi="Times New Roman" w:cs="Times New Roman"/>
-                          <w:color w:val="000000"/>
-                          <w:sz w:val="24"/>
-                          <w:szCs w:val="24"/>
-                        </w:rPr>
-                        <w:t>{%stamp_image}</w:t>
-                      </w:r>
-                      <w:r>
-                        <w:rPr>
-                          <w:rFonts w:ascii="Times New Roman" w:eastAsia="Times New Roman" w:hAnsi="Times New Roman" w:cs="Times New Roman"/>
-                          <w:color w:val="000000"/>
-                          <w:sz w:val="24"/>
-                          <w:szCs w:val="24"/>
-                        </w:rPr>
-                        <w:t>}</w:t>
+                        <w:t>{{%stamp_image}}</w:t>
                       </w:r>
                     </w:p>
                   </w:txbxContent>
@@ -1264,23 +1221,7 @@
                                 <w:sz w:val="24"/>
                                 <w:szCs w:val="24"/>
                               </w:rPr>
-                              <w:t>{</w:t>
-                            </w:r>
-                            <w:r>
-                              <w:rPr>
-                                <w:rFonts w:ascii="Times New Roman" w:eastAsia="Times New Roman" w:hAnsi="Times New Roman" w:cs="Times New Roman"/>
-                                <w:sz w:val="24"/>
-                                <w:szCs w:val="24"/>
-                              </w:rPr>
-                              <w:t>{%qr_code}</w:t>
-                            </w:r>
-                            <w:r>
-                              <w:rPr>
-                                <w:rFonts w:ascii="Times New Roman" w:eastAsia="Times New Roman" w:hAnsi="Times New Roman" w:cs="Times New Roman"/>
-                                <w:sz w:val="24"/>
-                                <w:szCs w:val="24"/>
-                              </w:rPr>
-                              <w:t>}</w:t>
+                              <w:t>{{%qr_code}}</w:t>
                             </w:r>
                           </w:p>
                           <w:p>
@@ -1333,23 +1274,7 @@
                           <w:sz w:val="24"/>
                           <w:szCs w:val="24"/>
                         </w:rPr>
-                        <w:t>{</w:t>
-                      </w:r>
-                      <w:r>
-                        <w:rPr>
-                          <w:rFonts w:ascii="Times New Roman" w:eastAsia="Times New Roman" w:hAnsi="Times New Roman" w:cs="Times New Roman"/>
-                          <w:sz w:val="24"/>
-                          <w:szCs w:val="24"/>
-                        </w:rPr>
-                        <w:t>{%qr_code}</w:t>
-                      </w:r>
-                      <w:r>
-                        <w:rPr>
-                          <w:rFonts w:ascii="Times New Roman" w:eastAsia="Times New Roman" w:hAnsi="Times New Roman" w:cs="Times New Roman"/>
-                          <w:sz w:val="24"/>
-                          <w:szCs w:val="24"/>
-                        </w:rPr>
-                        <w:t>}</w:t>
+                        <w:t>{{%qr_code}}</w:t>
                       </w:r>
                     </w:p>
                     <w:p>

</xml_diff>